<commit_message>
Actualiza el conteo de pruebas en la documentacion (269)
</commit_message>
<xml_diff>
--- a/entrega/GOSS_IP_Memoria_Tecnica.docx
+++ b/entrega/GOSS_IP_Memoria_Tecnica.docx
@@ -3086,7 +3086,7 @@
                 <w:b w:val="0"/>
                 <w:sz w:val="19"/>
               </w:rPr>
-              <w:t>IEC 62676-4 (DORI)</w:t>
+              <w:t>IEC 62696-4 (DORI)</w:t>
             </w:r>
           </w:p>
         </w:tc>
@@ -3142,7 +3142,7 @@
                 <w:b w:val="0"/>
                 <w:sz w:val="19"/>
               </w:rPr>
-              <w:t>IEC 62676-4 (DORI)</w:t>
+              <w:t>IEC 62696-4 (DORI)</w:t>
             </w:r>
           </w:p>
         </w:tc>
@@ -4809,7 +4809,7 @@
         <w:rPr>
           <w:b/>
         </w:rPr>
-        <w:t>267 pruebas automáticas</w:t>
+        <w:t>269 pruebas automáticas</w:t>
       </w:r>
       <w:r>
         <w:rPr>

</xml_diff>

<commit_message>
Documentacion de la Fase 2 al 7 de octubre
- Memoria tecnica: funciones nuevas, mediciones con las camaras reales,
  respaldo probado, arquitectura hibrida y control de cambios por commit;
  corrige la norma DORI (IEC 62676-4)
- Portafolio de evidencias: pruebas, validaciones, metricas y mejoras, cada
  una con su archivo y como reproducirla
- Bitacora del Bootcamp: sesiones de los tres dias con su vinculo al
  proyecto, control de cambios, respaldo fechado, ensayos y la lista final
  de verificacion de los lineamientos
- Presentacion: 277 pruebas, alerta de rostro, escalamiento hibrido y la
  norma DORI corregida
</commit_message>
<xml_diff>
--- a/entrega/GOSS_IP_Memoria_Tecnica.docx
+++ b/entrega/GOSS_IP_Memoria_Tecnica.docx
@@ -104,7 +104,7 @@
           <w:color w:val="55606E"/>
           <w:sz w:val="20"/>
         </w:rPr>
-        <w:t>Versión del 6 de octubre de 2026 (inicio del Bootcamp)</w:t>
+        <w:t>Versión del 7 de octubre de 2026 (Bootcamp, día 1)</w:t>
       </w:r>
     </w:p>
     <w:tbl>
@@ -529,6 +529,24 @@
       </w:r>
     </w:p>
     <w:p>
+      <w:pPr>
+        <w:pStyle w:val="ListBullet"/>
+        <w:spacing w:after="60"/>
+      </w:pPr>
+      <w:r>
+        <w:rPr>
+          <w:b/>
+        </w:rPr>
+        <w:t>Revisión de lecturas:</w:t>
+      </w:r>
+      <w:r>
+        <w:rPr>
+          <w:b w:val="0"/>
+        </w:rPr>
+        <w:t xml:space="preserve"> el operador confirma una placa o la marca como "no es placa"; lo revisado alimenta el reentrenamiento del OCR.</w:t>
+      </w:r>
+    </w:p>
+    <w:p>
       <w:r>
         <w:rPr>
           <w:b/>
@@ -879,6 +897,24 @@
         <w:rPr>
           <w:b/>
         </w:rPr>
+        <w:t>Avisa mientras pasa</w:t>
+      </w:r>
+      <w:r>
+        <w:rPr>
+          <w:b w:val="0"/>
+        </w:rPr>
+        <w:t>: una persona de la lista negra se reporta en cuanto se le ve de frente, con ella todavía frente a la cámara; no hay que esperar a que se vaya.</w:t>
+      </w:r>
+    </w:p>
+    <w:p>
+      <w:pPr>
+        <w:pStyle w:val="ListBullet"/>
+        <w:spacing w:after="60"/>
+      </w:pPr>
+      <w:r>
+        <w:rPr>
+          <w:b/>
+        </w:rPr>
         <w:t>Reglas explicables</w:t>
       </w:r>
       <w:r>
@@ -1028,7 +1064,7 @@
         <w:rPr>
           <w:b w:val="0"/>
         </w:rPr>
-        <w:t xml:space="preserve"> Una sola página sin framework ni CDN: funciona en una red sin internet. Recibe eventos y alertas por WebSocket y el video por WebRTC (go2rtc) o MJPEG.</w:t>
+        <w:t xml:space="preserve"> Una sola página sin framework ni CDN: funciona en una red sin internet. Recibe eventos y alertas por WebSocket y el video por WebRTC (go2rtc) o MJPEG. El video en vivo (20 cuadros por segundo) va aparte del análisis: las cajas se dibujan en el navegador y el video nunca espera a la IA.</w:t>
       </w:r>
     </w:p>
     <w:p>
@@ -1060,7 +1096,7 @@
         <w:rPr>
           <w:b w:val="0"/>
         </w:rPr>
-        <w:t>El detector encuentra la placa; el seguimiento la asocia a un mismo vehículo y se hacen hasta 10 lecturas de OCR mientras está en cuadro.</w:t>
+        <w:t>El detector encuentra la placa (confianza mínima 0.60); el seguimiento la asocia a un mismo vehículo y se hacen hasta 10 lecturas de OCR mientras está en cuadro.</w:t>
       </w:r>
     </w:p>
     <w:p>
@@ -1072,7 +1108,19 @@
         <w:rPr>
           <w:b w:val="0"/>
         </w:rPr>
-        <w:t>Al salir el vehículo, se elige la lectura por consenso carácter por carácter y se corrige por formato mexicano. Se pide una foto del canal principal (3200 × 1800) para la evidencia.</w:t>
+        <w:t xml:space="preserve">Solo se reporta si al menos </w:t>
+      </w:r>
+      <w:r>
+        <w:rPr>
+          <w:b/>
+        </w:rPr>
+        <w:t>3 lecturas independientes</w:t>
+      </w:r>
+      <w:r>
+        <w:rPr>
+          <w:b w:val="0"/>
+        </w:rPr>
+        <w:t xml:space="preserve"> coinciden con confianza alta (0.75): así una etiqueta o un letrero no se convierte en placa. Se elige la lectura por consenso carácter por carácter, se corrige por formato mexicano y se pide una foto del canal principal (3200 × 1800) para la evidencia.</w:t>
       </w:r>
     </w:p>
     <w:p>
@@ -1906,7 +1954,7 @@
                 <w:b w:val="0"/>
                 <w:sz w:val="19"/>
               </w:rPr>
-              <w:t>35/35 lecturas en fotos de prueba de lado, desde arriba, lejos y con poca luz (antes 20/35). Ver ADR-001.</w:t>
+              <w:t>35/35 lecturas en fotos de prueba de lado, desde arriba, lejos y con poca luz (antes 20/35). Ver ADR-001. Exige 3 lecturas coincidentes; el operador puede marcar "no es placa".</w:t>
             </w:r>
           </w:p>
         </w:tc>
@@ -2021,7 +2069,7 @@
                 <w:b w:val="0"/>
                 <w:sz w:val="19"/>
               </w:rPr>
-              <w:t>Umbral 0.50 de fábrica: falta calibrarlo con personas reales y su consentimiento.</w:t>
+              <w:t>Evento ~1 s después de ver el rostro de frente, con la persona aún en cuadro. Umbral 0.50 de fábrica: falta calibrarlo con personas reales y su consentimiento.</w:t>
             </w:r>
           </w:p>
         </w:tc>
@@ -2310,7 +2358,7 @@
                 <w:b w:val="0"/>
                 <w:sz w:val="19"/>
               </w:rPr>
-              <w:t>Clip de 10 s antes y después; Telegram, correo, WhatsApp, webhook.</w:t>
+              <w:t>Clip de 10 s antes y después; Telegram, correo, WhatsApp, webhook. Telegram configurado y probado con el bot del equipo (7 oct).</w:t>
             </w:r>
           </w:p>
         </w:tc>
@@ -3086,7 +3134,7 @@
                 <w:b w:val="0"/>
                 <w:sz w:val="19"/>
               </w:rPr>
-              <w:t>IEC 62696-4 (DORI)</w:t>
+              <w:t>IEC 62676-4 (DORI)</w:t>
             </w:r>
           </w:p>
         </w:tc>
@@ -3142,7 +3190,7 @@
                 <w:b w:val="0"/>
                 <w:sz w:val="19"/>
               </w:rPr>
-              <w:t>IEC 62696-4 (DORI)</w:t>
+              <w:t>IEC 62676-4 (DORI)</w:t>
             </w:r>
           </w:p>
         </w:tc>
@@ -3804,7 +3852,31 @@
         <w:rPr>
           <w:b w:val="0"/>
         </w:rPr>
-        <w:t xml:space="preserve"> salvo que el aviso de privacidad lo contemple.</w:t>
+        <w:t xml:space="preserve"> salvo que el aviso de privacidad lo contemple (en el stand se activa con el letrero de videovigilancia de demostración a la vista).</w:t>
+      </w:r>
+    </w:p>
+    <w:p>
+      <w:pPr>
+        <w:pStyle w:val="ListBullet"/>
+        <w:spacing w:after="60"/>
+      </w:pPr>
+      <w:r>
+        <w:rPr>
+          <w:b w:val="0"/>
+        </w:rPr>
+        <w:t xml:space="preserve">La copia de respaldo que sube a la nube </w:t>
+      </w:r>
+      <w:r>
+        <w:rPr>
+          <w:b/>
+        </w:rPr>
+        <w:t>no lleva</w:t>
+      </w:r>
+      <w:r>
+        <w:rPr>
+          <w:b w:val="0"/>
+        </w:rPr>
+        <w:t xml:space="preserve"> contraseñas de cámaras, tokens ni fotos.</w:t>
       </w:r>
     </w:p>
     <w:p>
@@ -4797,6 +4869,293 @@
         <w:pStyle w:val="Heading2"/>
       </w:pPr>
       <w:r>
+        <w:t>Con las dos cámaras reales del stand (7 de octubre)</w:t>
+      </w:r>
+    </w:p>
+    <w:tbl>
+      <w:tblPr>
+        <w:tblStyle w:val="TableGrid"/>
+        <w:tblW w:type="auto" w:w="0"/>
+        <w:jc w:val="center"/>
+        <w:tblLook w:firstColumn="1" w:firstRow="1" w:lastColumn="0" w:lastRow="0" w:noHBand="0" w:noVBand="1" w:val="04A0"/>
+      </w:tblPr>
+      <w:tblGrid>
+        <w:gridCol w:w="2408"/>
+        <w:gridCol w:w="2408"/>
+        <w:gridCol w:w="2408"/>
+        <w:gridCol w:w="2408"/>
+      </w:tblGrid>
+      <w:tr>
+        <w:tc>
+          <w:tcPr>
+            <w:tcW w:type="dxa" w:w="2835"/>
+            <w:shd w:val="clear" w:color="auto" w:fill="1E4FC9"/>
+          </w:tcPr>
+          <w:p>
+            <w:pPr>
+              <w:spacing w:after="20"/>
+            </w:pPr>
+            <w:r/>
+            <w:r>
+              <w:rPr>
+                <w:b/>
+                <w:color w:val="FFFFFF"/>
+                <w:sz w:val="19"/>
+              </w:rPr>
+              <w:t>Cámara</w:t>
+            </w:r>
+          </w:p>
+        </w:tc>
+        <w:tc>
+          <w:tcPr>
+            <w:tcW w:type="dxa" w:w="2835"/>
+            <w:shd w:val="clear" w:color="auto" w:fill="1E4FC9"/>
+          </w:tcPr>
+          <w:p>
+            <w:pPr>
+              <w:spacing w:after="20"/>
+            </w:pPr>
+            <w:r/>
+            <w:r>
+              <w:rPr>
+                <w:b/>
+                <w:color w:val="FFFFFF"/>
+                <w:sz w:val="19"/>
+              </w:rPr>
+              <w:t>Cuadros analizados por segundo</w:t>
+            </w:r>
+          </w:p>
+        </w:tc>
+        <w:tc>
+          <w:tcPr>
+            <w:tcW w:type="dxa" w:w="1701"/>
+            <w:shd w:val="clear" w:color="auto" w:fill="1E4FC9"/>
+          </w:tcPr>
+          <w:p>
+            <w:pPr>
+              <w:spacing w:after="20"/>
+            </w:pPr>
+            <w:r/>
+            <w:r>
+              <w:rPr>
+                <w:b/>
+                <w:color w:val="FFFFFF"/>
+                <w:sz w:val="19"/>
+              </w:rPr>
+              <w:t>Placas</w:t>
+            </w:r>
+          </w:p>
+        </w:tc>
+        <w:tc>
+          <w:tcPr>
+            <w:tcW w:type="dxa" w:w="1984"/>
+            <w:shd w:val="clear" w:color="auto" w:fill="1E4FC9"/>
+          </w:tcPr>
+          <w:p>
+            <w:pPr>
+              <w:spacing w:after="20"/>
+            </w:pPr>
+            <w:r/>
+            <w:r>
+              <w:rPr>
+                <w:b/>
+                <w:color w:val="FFFFFF"/>
+                <w:sz w:val="19"/>
+              </w:rPr>
+              <w:t>Rostros</w:t>
+            </w:r>
+          </w:p>
+        </w:tc>
+      </w:tr>
+      <w:tr>
+        <w:tc>
+          <w:tcPr>
+            <w:tcW w:type="dxa" w:w="2835"/>
+          </w:tcPr>
+          <w:p>
+            <w:pPr>
+              <w:spacing w:after="20"/>
+            </w:pPr>
+            <w:r/>
+            <w:r>
+              <w:rPr>
+                <w:b w:val="0"/>
+                <w:sz w:val="19"/>
+              </w:rPr>
+              <w:t>cam-01 (192.168.100.64)</w:t>
+            </w:r>
+          </w:p>
+        </w:tc>
+        <w:tc>
+          <w:tcPr>
+            <w:tcW w:type="dxa" w:w="2835"/>
+          </w:tcPr>
+          <w:p>
+            <w:pPr>
+              <w:spacing w:after="20"/>
+            </w:pPr>
+            <w:r/>
+            <w:r>
+              <w:rPr>
+                <w:b w:val="0"/>
+                <w:sz w:val="19"/>
+              </w:rPr>
+              <w:t>7.4</w:t>
+            </w:r>
+          </w:p>
+        </w:tc>
+        <w:tc>
+          <w:tcPr>
+            <w:tcW w:type="dxa" w:w="1701"/>
+          </w:tcPr>
+          <w:p>
+            <w:pPr>
+              <w:spacing w:after="20"/>
+            </w:pPr>
+            <w:r/>
+            <w:r>
+              <w:rPr>
+                <w:b w:val="0"/>
+                <w:sz w:val="19"/>
+              </w:rPr>
+              <w:t>38 ms</w:t>
+            </w:r>
+          </w:p>
+        </w:tc>
+        <w:tc>
+          <w:tcPr>
+            <w:tcW w:type="dxa" w:w="1984"/>
+          </w:tcPr>
+          <w:p>
+            <w:pPr>
+              <w:spacing w:after="20"/>
+            </w:pPr>
+            <w:r/>
+            <w:r>
+              <w:rPr>
+                <w:b w:val="0"/>
+                <w:sz w:val="19"/>
+              </w:rPr>
+              <w:t>19 ms</w:t>
+            </w:r>
+          </w:p>
+        </w:tc>
+      </w:tr>
+      <w:tr>
+        <w:tc>
+          <w:tcPr>
+            <w:tcW w:type="dxa" w:w="2835"/>
+            <w:shd w:val="clear" w:color="auto" w:fill="EEF3FB"/>
+          </w:tcPr>
+          <w:p>
+            <w:pPr>
+              <w:spacing w:after="20"/>
+            </w:pPr>
+            <w:r/>
+            <w:r>
+              <w:rPr>
+                <w:b w:val="0"/>
+                <w:sz w:val="19"/>
+              </w:rPr>
+              <w:t>cam-02 (192.168.100.65)</w:t>
+            </w:r>
+          </w:p>
+        </w:tc>
+        <w:tc>
+          <w:tcPr>
+            <w:tcW w:type="dxa" w:w="2835"/>
+            <w:shd w:val="clear" w:color="auto" w:fill="EEF3FB"/>
+          </w:tcPr>
+          <w:p>
+            <w:pPr>
+              <w:spacing w:after="20"/>
+            </w:pPr>
+            <w:r/>
+            <w:r>
+              <w:rPr>
+                <w:b w:val="0"/>
+                <w:sz w:val="19"/>
+              </w:rPr>
+              <w:t>7.7</w:t>
+            </w:r>
+          </w:p>
+        </w:tc>
+        <w:tc>
+          <w:tcPr>
+            <w:tcW w:type="dxa" w:w="1701"/>
+            <w:shd w:val="clear" w:color="auto" w:fill="EEF3FB"/>
+          </w:tcPr>
+          <w:p>
+            <w:pPr>
+              <w:spacing w:after="20"/>
+            </w:pPr>
+            <w:r/>
+            <w:r>
+              <w:rPr>
+                <w:b w:val="0"/>
+                <w:sz w:val="19"/>
+              </w:rPr>
+              <w:t>38 ms</w:t>
+            </w:r>
+          </w:p>
+        </w:tc>
+        <w:tc>
+          <w:tcPr>
+            <w:tcW w:type="dxa" w:w="1984"/>
+            <w:shd w:val="clear" w:color="auto" w:fill="EEF3FB"/>
+          </w:tcPr>
+          <w:p>
+            <w:pPr>
+              <w:spacing w:after="20"/>
+            </w:pPr>
+            <w:r/>
+            <w:r>
+              <w:rPr>
+                <w:b w:val="0"/>
+                <w:sz w:val="19"/>
+              </w:rPr>
+              <w:t>15 ms</w:t>
+            </w:r>
+          </w:p>
+        </w:tc>
+      </w:tr>
+    </w:tbl>
+    <w:p>
+      <w:pPr>
+        <w:spacing w:after="40"/>
+      </w:pPr>
+    </w:p>
+    <w:p>
+      <w:r>
+        <w:rPr>
+          <w:b w:val="0"/>
+          <w:i w:val="0"/>
+        </w:rPr>
+        <w:t>Cada cámara en su proceso con placas y rostros, a 8 fps pedidos: la GPU quedó al 38 % con 1.6 de 6 GB y la CPU de todo el equipo al 37 % (muestra de 5 s). Hay margen para activar movimiento y pose.</w:t>
+      </w:r>
+    </w:p>
+    <w:p>
+      <w:pPr>
+        <w:pStyle w:val="Heading2"/>
+      </w:pPr>
+      <w:r>
+        <w:t>Respaldo y recuperación</w:t>
+      </w:r>
+    </w:p>
+    <w:p>
+      <w:r>
+        <w:rPr>
+          <w:b w:val="0"/>
+          <w:i w:val="0"/>
+        </w:rPr>
+        <w:t>El 7 de octubre se restauró el sistema desde la copia en OneDrive, como si la laptop se hubiera perdido: huellas SHA-256 correctas, el código en el mismo commit, la base de datos íntegra y con los mismos registros (236 eventos, 24 alertas), y las pruebas pasando sobre el código restaurado. Restaurar tomó 2 segundos más la instalación de dependencias.</w:t>
+      </w:r>
+    </w:p>
+    <w:p>
+      <w:pPr>
+        <w:pStyle w:val="Heading2"/>
+      </w:pPr>
+      <w:r>
         <w:t>Calidad del software</w:t>
       </w:r>
     </w:p>
@@ -4809,13 +5168,13 @@
         <w:rPr>
           <w:b/>
         </w:rPr>
-        <w:t>269 pruebas automáticas</w:t>
+        <w:t>277 pruebas automáticas</w:t>
       </w:r>
       <w:r>
         <w:rPr>
           <w:b w:val="0"/>
         </w:rPr>
-        <w:t xml:space="preserve"> en 23 archivos, sin cámara ni GPU, en Windows y Linux, y contra PostgreSQL y Redis reales en la integración continua.</w:t>
+        <w:t xml:space="preserve"> en 24 archivos, sin cámara ni GPU. La integración continua las corre en Windows y Linux (Python 3.11 y 3.12) y contra PostgreSQL 16 y Redis 7, y construye la imagen Docker.</w:t>
       </w:r>
     </w:p>
     <w:p>
@@ -5117,13 +5476,67 @@
         <w:rPr>
           <w:b/>
         </w:rPr>
+        <w:t>Avisos al celular:</w:t>
+      </w:r>
+      <w:r>
+        <w:rPr>
+          <w:b w:val="0"/>
+        </w:rPr>
+        <w:t xml:space="preserve"> NOTIFY_TELEGRAM_TOKEN y NOTIFY_TELEGRAM_CHATS en el .env; se prueban en Administración → Notificaciones → Enviar prueba.</w:t>
+      </w:r>
+    </w:p>
+    <w:p>
+      <w:pPr>
+        <w:pStyle w:val="ListBullet"/>
+        <w:spacing w:after="60"/>
+      </w:pPr>
+      <w:r>
+        <w:rPr>
+          <w:b/>
+        </w:rPr>
+        <w:t>Nombre del sitio</w:t>
+      </w:r>
+      <w:r>
+        <w:rPr>
+          <w:b w:val="0"/>
+        </w:rPr>
+        <w:t xml:space="preserve"> en la pantalla de acceso: SITIO_NOMBRE en el .env.</w:t>
+      </w:r>
+    </w:p>
+    <w:p>
+      <w:pPr>
+        <w:pStyle w:val="ListBullet"/>
+        <w:spacing w:after="60"/>
+      </w:pPr>
+      <w:r>
+        <w:rPr>
+          <w:b/>
+        </w:rPr>
         <w:t>Respaldo:</w:t>
       </w:r>
       <w:r>
         <w:rPr>
           <w:b w:val="0"/>
         </w:rPr>
-        <w:t xml:space="preserve"> python tools/respaldo.py (código, configuración y base de datos).</w:t>
+        <w:t xml:space="preserve"> python tools/respaldo.py (local) y --nube (copia sin credenciales a OneDrive).</w:t>
+      </w:r>
+    </w:p>
+    <w:p>
+      <w:pPr>
+        <w:pStyle w:val="ListBullet"/>
+        <w:spacing w:after="60"/>
+      </w:pPr>
+      <w:r>
+        <w:rPr>
+          <w:b/>
+        </w:rPr>
+        <w:t>Recuperar en otro equipo:</w:t>
+      </w:r>
+      <w:r>
+        <w:rPr>
+          <w:b w:val="0"/>
+        </w:rPr>
+        <w:t xml:space="preserve"> git clone repo.bundle, instalar, copiar la base de datos del respaldo y volver a escribir el .env (las credenciales nunca viajan en el respaldo de la nube).</w:t>
       </w:r>
     </w:p>
     <w:p>
@@ -5257,6 +5670,274 @@
           <w:i w:val="0"/>
         </w:rPr>
         <w:t>El sistema crece agregando nodos de borde: cada nodo con GPU atiende sus cámaras y todos reportan a la misma API, que corre en varios procesos con PostgreSQL y Redis. Se despliega con Docker y HTTPS.</w:t>
+      </w:r>
+    </w:p>
+    <w:p>
+      <w:pPr>
+        <w:pStyle w:val="Heading2"/>
+      </w:pPr>
+      <w:r>
+        <w:t>Arquitectura híbrida para varios centros de mando</w:t>
+      </w:r>
+    </w:p>
+    <w:tbl>
+      <w:tblPr>
+        <w:tblStyle w:val="TableGrid"/>
+        <w:tblW w:type="auto" w:w="0"/>
+        <w:jc w:val="center"/>
+        <w:tblLook w:firstColumn="1" w:firstRow="1" w:lastColumn="0" w:lastRow="0" w:noHBand="0" w:noVBand="1" w:val="04A0"/>
+      </w:tblPr>
+      <w:tblGrid>
+        <w:gridCol w:w="3211"/>
+        <w:gridCol w:w="3211"/>
+        <w:gridCol w:w="3211"/>
+      </w:tblGrid>
+      <w:tr>
+        <w:tc>
+          <w:tcPr>
+            <w:tcW w:type="dxa" w:w="2154"/>
+            <w:shd w:val="clear" w:color="auto" w:fill="1E4FC9"/>
+          </w:tcPr>
+          <w:p>
+            <w:pPr>
+              <w:spacing w:after="20"/>
+            </w:pPr>
+            <w:r/>
+            <w:r>
+              <w:rPr>
+                <w:b/>
+                <w:color w:val="FFFFFF"/>
+                <w:sz w:val="19"/>
+              </w:rPr>
+              <w:t>Dónde</w:t>
+            </w:r>
+          </w:p>
+        </w:tc>
+        <w:tc>
+          <w:tcPr>
+            <w:tcW w:type="dxa" w:w="3628"/>
+            <w:shd w:val="clear" w:color="auto" w:fill="1E4FC9"/>
+          </w:tcPr>
+          <w:p>
+            <w:pPr>
+              <w:spacing w:after="20"/>
+            </w:pPr>
+            <w:r/>
+            <w:r>
+              <w:rPr>
+                <w:b/>
+                <w:color w:val="FFFFFF"/>
+                <w:sz w:val="19"/>
+              </w:rPr>
+              <w:t>Qué vive ahí</w:t>
+            </w:r>
+          </w:p>
+        </w:tc>
+        <w:tc>
+          <w:tcPr>
+            <w:tcW w:type="dxa" w:w="3572"/>
+            <w:shd w:val="clear" w:color="auto" w:fill="1E4FC9"/>
+          </w:tcPr>
+          <w:p>
+            <w:pPr>
+              <w:spacing w:after="20"/>
+            </w:pPr>
+            <w:r/>
+            <w:r>
+              <w:rPr>
+                <w:b/>
+                <w:color w:val="FFFFFF"/>
+                <w:sz w:val="19"/>
+              </w:rPr>
+              <w:t>Por qué</w:t>
+            </w:r>
+          </w:p>
+        </w:tc>
+      </w:tr>
+      <w:tr>
+        <w:tc>
+          <w:tcPr>
+            <w:tcW w:type="dxa" w:w="2154"/>
+          </w:tcPr>
+          <w:p>
+            <w:pPr>
+              <w:spacing w:after="20"/>
+            </w:pPr>
+            <w:r/>
+            <w:r>
+              <w:rPr>
+                <w:b w:val="0"/>
+                <w:sz w:val="19"/>
+              </w:rPr>
+              <w:t>Cada sitio</w:t>
+            </w:r>
+          </w:p>
+        </w:tc>
+        <w:tc>
+          <w:tcPr>
+            <w:tcW w:type="dxa" w:w="3628"/>
+          </w:tcPr>
+          <w:p>
+            <w:pPr>
+              <w:spacing w:after="20"/>
+            </w:pPr>
+            <w:r/>
+            <w:r>
+              <w:rPr>
+                <w:b w:val="0"/>
+                <w:sz w:val="19"/>
+              </w:rPr>
+              <w:t>Cámaras, nodo de borde con GPU y copia local de la lista negra</w:t>
+            </w:r>
+          </w:p>
+        </w:tc>
+        <w:tc>
+          <w:tcPr>
+            <w:tcW w:type="dxa" w:w="3572"/>
+          </w:tcPr>
+          <w:p>
+            <w:pPr>
+              <w:spacing w:after="20"/>
+            </w:pPr>
+            <w:r/>
+            <w:r>
+              <w:rPr>
+                <w:b w:val="0"/>
+                <w:sz w:val="19"/>
+              </w:rPr>
+              <w:t>El video y los rostros no salen del edificio; la detección sigue sin internet</w:t>
+            </w:r>
+          </w:p>
+        </w:tc>
+      </w:tr>
+      <w:tr>
+        <w:tc>
+          <w:tcPr>
+            <w:tcW w:type="dxa" w:w="2154"/>
+            <w:shd w:val="clear" w:color="auto" w:fill="EEF3FB"/>
+          </w:tcPr>
+          <w:p>
+            <w:pPr>
+              <w:spacing w:after="20"/>
+            </w:pPr>
+            <w:r/>
+            <w:r>
+              <w:rPr>
+                <w:b w:val="0"/>
+                <w:sz w:val="19"/>
+              </w:rPr>
+              <w:t>Servidor central o nube (Docker)</w:t>
+            </w:r>
+          </w:p>
+        </w:tc>
+        <w:tc>
+          <w:tcPr>
+            <w:tcW w:type="dxa" w:w="3628"/>
+            <w:shd w:val="clear" w:color="auto" w:fill="EEF3FB"/>
+          </w:tcPr>
+          <w:p>
+            <w:pPr>
+              <w:spacing w:after="20"/>
+            </w:pPr>
+            <w:r/>
+            <w:r>
+              <w:rPr>
+                <w:b w:val="0"/>
+                <w:sz w:val="19"/>
+              </w:rPr>
+              <w:t>Lista negra maestra cifrada, API, dashboard y respaldo diario</w:t>
+            </w:r>
+          </w:p>
+        </w:tc>
+        <w:tc>
+          <w:tcPr>
+            <w:tcW w:type="dxa" w:w="3572"/>
+            <w:shd w:val="clear" w:color="auto" w:fill="EEF3FB"/>
+          </w:tcPr>
+          <w:p>
+            <w:pPr>
+              <w:spacing w:after="20"/>
+            </w:pPr>
+            <w:r/>
+            <w:r>
+              <w:rPr>
+                <w:b w:val="0"/>
+                <w:sz w:val="19"/>
+              </w:rPr>
+              <w:t>Todos los centros comparten la misma lista; recuperación ante un accidente</w:t>
+            </w:r>
+          </w:p>
+        </w:tc>
+      </w:tr>
+      <w:tr>
+        <w:tc>
+          <w:tcPr>
+            <w:tcW w:type="dxa" w:w="2154"/>
+          </w:tcPr>
+          <w:p>
+            <w:pPr>
+              <w:spacing w:after="20"/>
+            </w:pPr>
+            <w:r/>
+            <w:r>
+              <w:rPr>
+                <w:b w:val="0"/>
+                <w:sz w:val="19"/>
+              </w:rPr>
+              <w:t>Repositorio</w:t>
+            </w:r>
+          </w:p>
+        </w:tc>
+        <w:tc>
+          <w:tcPr>
+            <w:tcW w:type="dxa" w:w="3628"/>
+          </w:tcPr>
+          <w:p>
+            <w:pPr>
+              <w:spacing w:after="20"/>
+            </w:pPr>
+            <w:r/>
+            <w:r>
+              <w:rPr>
+                <w:b w:val="0"/>
+                <w:sz w:val="19"/>
+              </w:rPr>
+              <w:t>Código y configuración de ejemplo (sin .env ni modelos)</w:t>
+            </w:r>
+          </w:p>
+        </w:tc>
+        <w:tc>
+          <w:tcPr>
+            <w:tcW w:type="dxa" w:w="3572"/>
+          </w:tcPr>
+          <w:p>
+            <w:pPr>
+              <w:spacing w:after="20"/>
+            </w:pPr>
+            <w:r/>
+            <w:r>
+              <w:rPr>
+                <w:b w:val="0"/>
+                <w:sz w:val="19"/>
+              </w:rPr>
+              <w:t>Un equipo nuevo se levanta en minutos; los modelos se descargan de su fuente oficial</w:t>
+            </w:r>
+          </w:p>
+        </w:tc>
+      </w:tr>
+    </w:tbl>
+    <w:p>
+      <w:pPr>
+        <w:spacing w:after="40"/>
+      </w:pPr>
+    </w:p>
+    <w:p>
+      <w:r>
+        <w:rPr>
+          <w:b w:val="0"/>
+          <w:i w:val="0"/>
+        </w:rPr>
+        <w:t>No se manda el video a la nube: costaría ancho de banda y una GPU rentada por servidor, y sacaría del sitio datos biométricos. Lo que viaja son eventos y fotos, que pesan poco. Hoy el prototipo corre completo en un equipo; la lista negra maestra compartida es el siguiente paso de arquitectura.</w:t>
       </w:r>
     </w:p>
     <w:tbl>
@@ -5593,10 +6274,22 @@
     </w:p>
     <w:p>
       <w:pPr>
+        <w:pStyle w:val="ListBullet"/>
+        <w:spacing w:after="60"/>
+      </w:pPr>
+      <w:r>
+        <w:rPr>
+          <w:b w:val="0"/>
+        </w:rPr>
+        <w:t>Lista negra maestra compartida entre centros de mando, con copia local en cada sitio, y respaldo diario automático.</w:t>
+      </w:r>
+    </w:p>
+    <w:p>
+      <w:pPr>
         <w:pStyle w:val="Heading1"/>
       </w:pPr>
       <w:r>
-        <w:t>15. Mejoras incorporadas durante el Bootcamp</w:t>
+        <w:t>15. Mejoras incorporadas en la Fase 2</w:t>
       </w:r>
     </w:p>
     <w:p>
@@ -5605,7 +6298,7 @@
           <w:b w:val="0"/>
           <w:i w:val="0"/>
         </w:rPr>
-        <w:t>Control de cambios a partir del 6 de octubre de 2026 (rama innovatics-final). Se actualiza cada día con lo que resulte de las asesorías.</w:t>
+        <w:t>Control de cambios de la rama innovatics-final, tomado del historial de Git (cada fila es un commit verificable). Se actualiza cada día con lo que resulte de las asesorías.</w:t>
       </w:r>
     </w:p>
     <w:tbl>
@@ -5616,14 +6309,15 @@
         <w:tblLook w:firstColumn="1" w:firstRow="1" w:lastColumn="0" w:lastRow="0" w:noHBand="0" w:noVBand="1" w:val="04A0"/>
       </w:tblPr>
       <w:tblGrid>
-        <w:gridCol w:w="3211"/>
-        <w:gridCol w:w="3211"/>
-        <w:gridCol w:w="3211"/>
+        <w:gridCol w:w="2408"/>
+        <w:gridCol w:w="2408"/>
+        <w:gridCol w:w="2408"/>
+        <w:gridCol w:w="2408"/>
       </w:tblGrid>
       <w:tr>
         <w:tc>
           <w:tcPr>
-            <w:tcW w:type="dxa" w:w="907"/>
+            <w:tcW w:type="dxa" w:w="1361"/>
             <w:shd w:val="clear" w:color="auto" w:fill="1E4FC9"/>
           </w:tcPr>
           <w:p>
@@ -5635,15 +6329,15 @@
               <w:rPr>
                 <w:b/>
                 <w:color w:val="FFFFFF"/>
-                <w:sz w:val="19"/>
+                <w:sz w:val="18"/>
               </w:rPr>
-              <w:t>Fecha</w:t>
+              <w:t>Fecha y hora</w:t>
             </w:r>
           </w:p>
         </w:tc>
         <w:tc>
           <w:tcPr>
-            <w:tcW w:type="dxa" w:w="5102"/>
+            <w:tcW w:type="dxa" w:w="1020"/>
             <w:shd w:val="clear" w:color="auto" w:fill="1E4FC9"/>
           </w:tcPr>
           <w:p>
@@ -5655,15 +6349,15 @@
               <w:rPr>
                 <w:b/>
                 <w:color w:val="FFFFFF"/>
-                <w:sz w:val="19"/>
+                <w:sz w:val="18"/>
               </w:rPr>
-              <w:t>Mejora</w:t>
+              <w:t>Commit</w:t>
             </w:r>
           </w:p>
         </w:tc>
         <w:tc>
           <w:tcPr>
-            <w:tcW w:type="dxa" w:w="3345"/>
+            <w:tcW w:type="dxa" w:w="4195"/>
             <w:shd w:val="clear" w:color="auto" w:fill="1E4FC9"/>
           </w:tcPr>
           <w:p>
@@ -5675,7 +6369,27 @@
               <w:rPr>
                 <w:b/>
                 <w:color w:val="FFFFFF"/>
-                <w:sz w:val="19"/>
+                <w:sz w:val="18"/>
+              </w:rPr>
+              <w:t>Mejora</w:t>
+            </w:r>
+          </w:p>
+        </w:tc>
+        <w:tc>
+          <w:tcPr>
+            <w:tcW w:type="dxa" w:w="2778"/>
+            <w:shd w:val="clear" w:color="auto" w:fill="1E4FC9"/>
+          </w:tcPr>
+          <w:p>
+            <w:pPr>
+              <w:spacing w:after="20"/>
+            </w:pPr>
+            <w:r/>
+            <w:r>
+              <w:rPr>
+                <w:b/>
+                <w:color w:val="FFFFFF"/>
+                <w:sz w:val="18"/>
               </w:rPr>
               <w:t>Por qué</w:t>
             </w:r>
@@ -5685,7 +6399,7 @@
       <w:tr>
         <w:tc>
           <w:tcPr>
-            <w:tcW w:type="dxa" w:w="907"/>
+            <w:tcW w:type="dxa" w:w="1361"/>
           </w:tcPr>
           <w:p>
             <w:pPr>
@@ -5695,15 +6409,15 @@
             <w:r>
               <w:rPr>
                 <w:b w:val="0"/>
-                <w:sz w:val="19"/>
+                <w:sz w:val="18"/>
               </w:rPr>
-              <w:t>6 oct</w:t>
+              <w:t>6 oct 11:31</w:t>
             </w:r>
           </w:p>
         </w:tc>
         <w:tc>
           <w:tcPr>
-            <w:tcW w:type="dxa" w:w="5102"/>
+            <w:tcW w:type="dxa" w:w="1020"/>
           </w:tcPr>
           <w:p>
             <w:pPr>
@@ -5713,15 +6427,15 @@
             <w:r>
               <w:rPr>
                 <w:b w:val="0"/>
-                <w:sz w:val="19"/>
+                <w:sz w:val="18"/>
               </w:rPr>
-              <w:t>Catálogo de cámaras: buscar, diagnosticar, recomendar y dar de alta desde el navegador</w:t>
+              <w:t>0130a8d</w:t>
             </w:r>
           </w:p>
         </w:tc>
         <w:tc>
           <w:tcPr>
-            <w:tcW w:type="dxa" w:w="3345"/>
+            <w:tcW w:type="dxa" w:w="4195"/>
           </w:tcPr>
           <w:p>
             <w:pPr>
@@ -5731,9 +6445,27 @@
             <w:r>
               <w:rPr>
                 <w:b w:val="0"/>
-                <w:sz w:val="19"/>
+                <w:sz w:val="18"/>
               </w:rPr>
-              <w:t>Instalación y escalabilidad sin terminal</w:t>
+              <w:t>Arquitectura de red y despliegue para campus; plan de validación de campo</w:t>
+            </w:r>
+          </w:p>
+        </w:tc>
+        <w:tc>
+          <w:tcPr>
+            <w:tcW w:type="dxa" w:w="2778"/>
+          </w:tcPr>
+          <w:p>
+            <w:pPr>
+              <w:spacing w:after="20"/>
+            </w:pPr>
+            <w:r/>
+            <w:r>
+              <w:rPr>
+                <w:b w:val="0"/>
+                <w:sz w:val="18"/>
+              </w:rPr>
+              <w:t>Cómo se instalaría en la universidad</w:t>
             </w:r>
           </w:p>
         </w:tc>
@@ -5741,7 +6473,7 @@
       <w:tr>
         <w:tc>
           <w:tcPr>
-            <w:tcW w:type="dxa" w:w="907"/>
+            <w:tcW w:type="dxa" w:w="1361"/>
             <w:shd w:val="clear" w:color="auto" w:fill="EEF3FB"/>
           </w:tcPr>
           <w:p>
@@ -5752,15 +6484,15 @@
             <w:r>
               <w:rPr>
                 <w:b w:val="0"/>
-                <w:sz w:val="19"/>
+                <w:sz w:val="18"/>
               </w:rPr>
-              <w:t>6 oct</w:t>
+              <w:t>6 oct 20:00</w:t>
             </w:r>
           </w:p>
         </w:tc>
         <w:tc>
           <w:tcPr>
-            <w:tcW w:type="dxa" w:w="5102"/>
+            <w:tcW w:type="dxa" w:w="1020"/>
             <w:shd w:val="clear" w:color="auto" w:fill="EEF3FB"/>
           </w:tcPr>
           <w:p>
@@ -5771,15 +6503,15 @@
             <w:r>
               <w:rPr>
                 <w:b w:val="0"/>
-                <w:sz w:val="19"/>
+                <w:sz w:val="18"/>
               </w:rPr>
-              <w:t>Recomendador de instalación (DORI, px de placa y rostro, ángulo, alcance)</w:t>
+              <w:t>5ad34f8</w:t>
             </w:r>
           </w:p>
         </w:tc>
         <w:tc>
           <w:tcPr>
-            <w:tcW w:type="dxa" w:w="3345"/>
+            <w:tcW w:type="dxa" w:w="4195"/>
             <w:shd w:val="clear" w:color="auto" w:fill="EEF3FB"/>
           </w:tcPr>
           <w:p>
@@ -5790,73 +6522,15 @@
             <w:r>
               <w:rPr>
                 <w:b w:val="0"/>
-                <w:sz w:val="19"/>
+                <w:sz w:val="18"/>
               </w:rPr>
-              <w:t>Saber qué puede hacer una cámara antes de instalarla</w:t>
-            </w:r>
-          </w:p>
-        </w:tc>
-      </w:tr>
-      <w:tr>
-        <w:tc>
-          <w:tcPr>
-            <w:tcW w:type="dxa" w:w="907"/>
-          </w:tcPr>
-          <w:p>
-            <w:pPr>
-              <w:spacing w:after="20"/>
-            </w:pPr>
-            <w:r/>
-            <w:r>
-              <w:rPr>
-                <w:b w:val="0"/>
-                <w:sz w:val="19"/>
-              </w:rPr>
-              <w:t>6 oct</w:t>
+              <w:t>Respaldo completo con manifiesto SHA-256 (tools/respaldo.py)</w:t>
             </w:r>
           </w:p>
         </w:tc>
         <w:tc>
           <w:tcPr>
-            <w:tcW w:type="dxa" w:w="5102"/>
-          </w:tcPr>
-          <w:p>
-            <w:pPr>
-              <w:spacing w:after="20"/>
-            </w:pPr>
-            <w:r/>
-            <w:r>
-              <w:rPr>
-                <w:b w:val="0"/>
-                <w:sz w:val="19"/>
-              </w:rPr>
-              <w:t>La contraseña de la cámara se prueba una sola vez</w:t>
-            </w:r>
-          </w:p>
-        </w:tc>
-        <w:tc>
-          <w:tcPr>
-            <w:tcW w:type="dxa" w:w="3345"/>
-          </w:tcPr>
-          <w:p>
-            <w:pPr>
-              <w:spacing w:after="20"/>
-            </w:pPr>
-            <w:r/>
-            <w:r>
-              <w:rPr>
-                <w:b w:val="0"/>
-                <w:sz w:val="19"/>
-              </w:rPr>
-              <w:t>El método anterior hacía hasta 6 intentos y podía bloquear la cámara</w:t>
-            </w:r>
-          </w:p>
-        </w:tc>
-      </w:tr>
-      <w:tr>
-        <w:tc>
-          <w:tcPr>
-            <w:tcW w:type="dxa" w:w="907"/>
+            <w:tcW w:type="dxa" w:w="2778"/>
             <w:shd w:val="clear" w:color="auto" w:fill="EEF3FB"/>
           </w:tcPr>
           <w:p>
@@ -5867,15 +6541,91 @@
             <w:r>
               <w:rPr>
                 <w:b w:val="0"/>
-                <w:sz w:val="19"/>
+                <w:sz w:val="18"/>
               </w:rPr>
-              <w:t>6 oct</w:t>
+              <w:t>Volver a una versión funcional en minutos</w:t>
+            </w:r>
+          </w:p>
+        </w:tc>
+      </w:tr>
+      <w:tr>
+        <w:tc>
+          <w:tcPr>
+            <w:tcW w:type="dxa" w:w="1361"/>
+          </w:tcPr>
+          <w:p>
+            <w:pPr>
+              <w:spacing w:after="20"/>
+            </w:pPr>
+            <w:r/>
+            <w:r>
+              <w:rPr>
+                <w:b w:val="0"/>
+                <w:sz w:val="18"/>
+              </w:rPr>
+              <w:t>6 oct 20:34</w:t>
             </w:r>
           </w:p>
         </w:tc>
         <w:tc>
           <w:tcPr>
-            <w:tcW w:type="dxa" w:w="5102"/>
+            <w:tcW w:type="dxa" w:w="1020"/>
+          </w:tcPr>
+          <w:p>
+            <w:pPr>
+              <w:spacing w:after="20"/>
+            </w:pPr>
+            <w:r/>
+            <w:r>
+              <w:rPr>
+                <w:b w:val="0"/>
+                <w:sz w:val="18"/>
+              </w:rPr>
+              <w:t>7f0afb1</w:t>
+            </w:r>
+          </w:p>
+        </w:tc>
+        <w:tc>
+          <w:tcPr>
+            <w:tcW w:type="dxa" w:w="4195"/>
+          </w:tcPr>
+          <w:p>
+            <w:pPr>
+              <w:spacing w:after="20"/>
+            </w:pPr>
+            <w:r/>
+            <w:r>
+              <w:rPr>
+                <w:b w:val="0"/>
+                <w:sz w:val="18"/>
+              </w:rPr>
+              <w:t>Video local como cámara, en bucle y a velocidad real</w:t>
+            </w:r>
+          </w:p>
+        </w:tc>
+        <w:tc>
+          <w:tcPr>
+            <w:tcW w:type="dxa" w:w="2778"/>
+          </w:tcPr>
+          <w:p>
+            <w:pPr>
+              <w:spacing w:after="20"/>
+            </w:pPr>
+            <w:r/>
+            <w:r>
+              <w:rPr>
+                <w:b w:val="0"/>
+                <w:sz w:val="18"/>
+              </w:rPr>
+              <w:t>Plan B de la demo</w:t>
+            </w:r>
+          </w:p>
+        </w:tc>
+      </w:tr>
+      <w:tr>
+        <w:tc>
+          <w:tcPr>
+            <w:tcW w:type="dxa" w:w="1361"/>
             <w:shd w:val="clear" w:color="auto" w:fill="EEF3FB"/>
           </w:tcPr>
           <w:p>
@@ -5886,15 +6636,15 @@
             <w:r>
               <w:rPr>
                 <w:b w:val="0"/>
-                <w:sz w:val="19"/>
+                <w:sz w:val="18"/>
               </w:rPr>
-              <w:t>Reconoce una cámara por serie o MAC si el router le cambia la IP</w:t>
+              <w:t>6 oct 20:34</w:t>
             </w:r>
           </w:p>
         </w:tc>
         <w:tc>
           <w:tcPr>
-            <w:tcW w:type="dxa" w:w="3345"/>
+            <w:tcW w:type="dxa" w:w="1020"/>
             <w:shd w:val="clear" w:color="auto" w:fill="EEF3FB"/>
           </w:tcPr>
           <w:p>
@@ -5905,73 +6655,15 @@
             <w:r>
               <w:rPr>
                 <w:b w:val="0"/>
-                <w:sz w:val="19"/>
+                <w:sz w:val="18"/>
               </w:rPr>
-              <w:t>Le pasó dos veces a la cámara del equipo</w:t>
-            </w:r>
-          </w:p>
-        </w:tc>
-      </w:tr>
-      <w:tr>
-        <w:tc>
-          <w:tcPr>
-            <w:tcW w:type="dxa" w:w="907"/>
-          </w:tcPr>
-          <w:p>
-            <w:pPr>
-              <w:spacing w:after="20"/>
-            </w:pPr>
-            <w:r/>
-            <w:r>
-              <w:rPr>
-                <w:b w:val="0"/>
-                <w:sz w:val="19"/>
-              </w:rPr>
-              <w:t>6 oct</w:t>
+              <w:t>67527b4</w:t>
             </w:r>
           </w:p>
         </w:tc>
         <w:tc>
           <w:tcPr>
-            <w:tcW w:type="dxa" w:w="5102"/>
-          </w:tcPr>
-          <w:p>
-            <w:pPr>
-              <w:spacing w:after="20"/>
-            </w:pPr>
-            <w:r/>
-            <w:r>
-              <w:rPr>
-                <w:b w:val="0"/>
-                <w:sz w:val="19"/>
-              </w:rPr>
-              <w:t>Medición de capacidad y un proceso por cámara</w:t>
-            </w:r>
-          </w:p>
-        </w:tc>
-        <w:tc>
-          <w:tcPr>
-            <w:tcW w:type="dxa" w:w="3345"/>
-          </w:tcPr>
-          <w:p>
-            <w:pPr>
-              <w:spacing w:after="20"/>
-            </w:pPr>
-            <w:r/>
-            <w:r>
-              <w:rPr>
-                <w:b w:val="0"/>
-                <w:sz w:val="19"/>
-              </w:rPr>
-              <w:t>+67 % de cuadros analizados con 4 cámaras</w:t>
-            </w:r>
-          </w:p>
-        </w:tc>
-      </w:tr>
-      <w:tr>
-        <w:tc>
-          <w:tcPr>
-            <w:tcW w:type="dxa" w:w="907"/>
+            <w:tcW w:type="dxa" w:w="4195"/>
             <w:shd w:val="clear" w:color="auto" w:fill="EEF3FB"/>
           </w:tcPr>
           <w:p>
@@ -5982,15 +6674,15 @@
             <w:r>
               <w:rPr>
                 <w:b w:val="0"/>
-                <w:sz w:val="19"/>
+                <w:sz w:val="18"/>
               </w:rPr>
-              <w:t>6 oct</w:t>
+              <w:t>Catálogo de cámaras: buscar, diagnosticar, recomendar y dar de alta</w:t>
             </w:r>
           </w:p>
         </w:tc>
         <w:tc>
           <w:tcPr>
-            <w:tcW w:type="dxa" w:w="5102"/>
+            <w:tcW w:type="dxa" w:w="2778"/>
             <w:shd w:val="clear" w:color="auto" w:fill="EEF3FB"/>
           </w:tcPr>
           <w:p>
@@ -6001,15 +6693,91 @@
             <w:r>
               <w:rPr>
                 <w:b w:val="0"/>
-                <w:sz w:val="19"/>
+                <w:sz w:val="18"/>
               </w:rPr>
-              <w:t>Métricas reales (tools/metricas.py) y latido por ventana de 15 s</w:t>
+              <w:t>Instalar sin terminal; escalar a más cámaras</w:t>
+            </w:r>
+          </w:p>
+        </w:tc>
+      </w:tr>
+      <w:tr>
+        <w:tc>
+          <w:tcPr>
+            <w:tcW w:type="dxa" w:w="1361"/>
+          </w:tcPr>
+          <w:p>
+            <w:pPr>
+              <w:spacing w:after="20"/>
+            </w:pPr>
+            <w:r/>
+            <w:r>
+              <w:rPr>
+                <w:b w:val="0"/>
+                <w:sz w:val="18"/>
+              </w:rPr>
+              <w:t>6 oct 20:48</w:t>
             </w:r>
           </w:p>
         </w:tc>
         <w:tc>
           <w:tcPr>
-            <w:tcW w:type="dxa" w:w="3345"/>
+            <w:tcW w:type="dxa" w:w="1020"/>
+          </w:tcPr>
+          <w:p>
+            <w:pPr>
+              <w:spacing w:after="20"/>
+            </w:pPr>
+            <w:r/>
+            <w:r>
+              <w:rPr>
+                <w:b w:val="0"/>
+                <w:sz w:val="18"/>
+              </w:rPr>
+              <w:t>ea5115a</w:t>
+            </w:r>
+          </w:p>
+        </w:tc>
+        <w:tc>
+          <w:tcPr>
+            <w:tcW w:type="dxa" w:w="4195"/>
+          </w:tcPr>
+          <w:p>
+            <w:pPr>
+              <w:spacing w:after="20"/>
+            </w:pPr>
+            <w:r/>
+            <w:r>
+              <w:rPr>
+                <w:b w:val="0"/>
+                <w:sz w:val="18"/>
+              </w:rPr>
+              <w:t>Salvaguarda en la purga de evidencia</w:t>
+            </w:r>
+          </w:p>
+        </w:tc>
+        <w:tc>
+          <w:tcPr>
+            <w:tcW w:type="dxa" w:w="2778"/>
+          </w:tcPr>
+          <w:p>
+            <w:pPr>
+              <w:spacing w:after="20"/>
+            </w:pPr>
+            <w:r/>
+            <w:r>
+              <w:rPr>
+                <w:b w:val="0"/>
+                <w:sz w:val="18"/>
+              </w:rPr>
+              <w:t>Las pruebas llegaron a borrar fotos reales; ya no pueden</w:t>
+            </w:r>
+          </w:p>
+        </w:tc>
+      </w:tr>
+      <w:tr>
+        <w:tc>
+          <w:tcPr>
+            <w:tcW w:type="dxa" w:w="1361"/>
             <w:shd w:val="clear" w:color="auto" w:fill="EEF3FB"/>
           </w:tcPr>
           <w:p>
@@ -6020,73 +6788,15 @@
             <w:r>
               <w:rPr>
                 <w:b w:val="0"/>
-                <w:sz w:val="19"/>
+                <w:sz w:val="18"/>
               </w:rPr>
-              <w:t>Los promedios desde el arranque subestimaban los fps</w:t>
-            </w:r>
-          </w:p>
-        </w:tc>
-      </w:tr>
-      <w:tr>
-        <w:tc>
-          <w:tcPr>
-            <w:tcW w:type="dxa" w:w="907"/>
-          </w:tcPr>
-          <w:p>
-            <w:pPr>
-              <w:spacing w:after="20"/>
-            </w:pPr>
-            <w:r/>
-            <w:r>
-              <w:rPr>
-                <w:b w:val="0"/>
-                <w:sz w:val="19"/>
-              </w:rPr>
-              <w:t>6 oct</w:t>
+              <w:t>6 oct 20:52</w:t>
             </w:r>
           </w:p>
         </w:tc>
         <w:tc>
           <w:tcPr>
-            <w:tcW w:type="dxa" w:w="5102"/>
-          </w:tcPr>
-          <w:p>
-            <w:pPr>
-              <w:spacing w:after="20"/>
-            </w:pPr>
-            <w:r/>
-            <w:r>
-              <w:rPr>
-                <w:b w:val="0"/>
-                <w:sz w:val="19"/>
-              </w:rPr>
-              <w:t>Salvaguarda en la purga de evidencia</w:t>
-            </w:r>
-          </w:p>
-        </w:tc>
-        <w:tc>
-          <w:tcPr>
-            <w:tcW w:type="dxa" w:w="3345"/>
-          </w:tcPr>
-          <w:p>
-            <w:pPr>
-              <w:spacing w:after="20"/>
-            </w:pPr>
-            <w:r/>
-            <w:r>
-              <w:rPr>
-                <w:b w:val="0"/>
-                <w:sz w:val="19"/>
-              </w:rPr>
-              <w:t>Evita borrar evidencia al apuntar a otra base de datos</w:t>
-            </w:r>
-          </w:p>
-        </w:tc>
-      </w:tr>
-      <w:tr>
-        <w:tc>
-          <w:tcPr>
-            <w:tcW w:type="dxa" w:w="907"/>
+            <w:tcW w:type="dxa" w:w="1020"/>
             <w:shd w:val="clear" w:color="auto" w:fill="EEF3FB"/>
           </w:tcPr>
           <w:p>
@@ -6097,15 +6807,15 @@
             <w:r>
               <w:rPr>
                 <w:b w:val="0"/>
-                <w:sz w:val="19"/>
+                <w:sz w:val="18"/>
               </w:rPr>
-              <w:t>6 oct</w:t>
+              <w:t>fa69b2c</w:t>
             </w:r>
           </w:p>
         </w:tc>
         <w:tc>
           <w:tcPr>
-            <w:tcW w:type="dxa" w:w="5102"/>
+            <w:tcW w:type="dxa" w:w="4195"/>
             <w:shd w:val="clear" w:color="auto" w:fill="EEF3FB"/>
           </w:tcPr>
           <w:p>
@@ -6116,15 +6826,15 @@
             <w:r>
               <w:rPr>
                 <w:b w:val="0"/>
-                <w:sz w:val="19"/>
+                <w:sz w:val="18"/>
               </w:rPr>
-              <w:t>Video local como cámara (en bucle y a velocidad real)</w:t>
+              <w:t>Placa de prueba imprimible, validada con los modelos</w:t>
             </w:r>
           </w:p>
         </w:tc>
         <w:tc>
           <w:tcPr>
-            <w:tcW w:type="dxa" w:w="3345"/>
+            <w:tcW w:type="dxa" w:w="2778"/>
             <w:shd w:val="clear" w:color="auto" w:fill="EEF3FB"/>
           </w:tcPr>
           <w:p>
@@ -6135,9 +6845,9 @@
             <w:r>
               <w:rPr>
                 <w:b w:val="0"/>
-                <w:sz w:val="19"/>
+                <w:sz w:val="18"/>
               </w:rPr>
-              <w:t>Plan de contingencia B de la demo</w:t>
+              <w:t>Accesorio de respaldo</w:t>
             </w:r>
           </w:p>
         </w:tc>
@@ -6145,7 +6855,7 @@
       <w:tr>
         <w:tc>
           <w:tcPr>
-            <w:tcW w:type="dxa" w:w="907"/>
+            <w:tcW w:type="dxa" w:w="1361"/>
           </w:tcPr>
           <w:p>
             <w:pPr>
@@ -6155,15 +6865,15 @@
             <w:r>
               <w:rPr>
                 <w:b w:val="0"/>
-                <w:sz w:val="19"/>
+                <w:sz w:val="18"/>
               </w:rPr>
-              <w:t>6 oct</w:t>
+              <w:t>6 oct 21:08</w:t>
             </w:r>
           </w:p>
         </w:tc>
         <w:tc>
           <w:tcPr>
-            <w:tcW w:type="dxa" w:w="5102"/>
+            <w:tcW w:type="dxa" w:w="1020"/>
           </w:tcPr>
           <w:p>
             <w:pPr>
@@ -6173,15 +6883,15 @@
             <w:r>
               <w:rPr>
                 <w:b w:val="0"/>
-                <w:sz w:val="19"/>
+                <w:sz w:val="18"/>
               </w:rPr>
-              <w:t>Respaldo completo con manifiesto (tools/respaldo.py)</w:t>
+              <w:t>8493a02</w:t>
             </w:r>
           </w:p>
         </w:tc>
         <w:tc>
           <w:tcPr>
-            <w:tcW w:type="dxa" w:w="3345"/>
+            <w:tcW w:type="dxa" w:w="4195"/>
           </w:tcPr>
           <w:p>
             <w:pPr>
@@ -6191,9 +6901,27 @@
             <w:r>
               <w:rPr>
                 <w:b w:val="0"/>
-                <w:sz w:val="19"/>
+                <w:sz w:val="18"/>
               </w:rPr>
-              <w:t>Volver a una versión funcional en minutos</w:t>
+              <w:t>Métricas reales y latido por ventana; medición de capacidad</w:t>
+            </w:r>
+          </w:p>
+        </w:tc>
+        <w:tc>
+          <w:tcPr>
+            <w:tcW w:type="dxa" w:w="2778"/>
+          </w:tcPr>
+          <w:p>
+            <w:pPr>
+              <w:spacing w:after="20"/>
+            </w:pPr>
+            <w:r/>
+            <w:r>
+              <w:rPr>
+                <w:b w:val="0"/>
+                <w:sz w:val="18"/>
+              </w:rPr>
+              <w:t>Un proceso por cámara rinde 67 % más</w:t>
             </w:r>
           </w:p>
         </w:tc>
@@ -6201,7 +6929,7 @@
       <w:tr>
         <w:tc>
           <w:tcPr>
-            <w:tcW w:type="dxa" w:w="907"/>
+            <w:tcW w:type="dxa" w:w="1361"/>
             <w:shd w:val="clear" w:color="auto" w:fill="EEF3FB"/>
           </w:tcPr>
           <w:p>
@@ -6212,15 +6940,15 @@
             <w:r>
               <w:rPr>
                 <w:b w:val="0"/>
-                <w:sz w:val="19"/>
+                <w:sz w:val="18"/>
               </w:rPr>
-              <w:t>6 oct</w:t>
+              <w:t>6 oct 21:10</w:t>
             </w:r>
           </w:p>
         </w:tc>
         <w:tc>
           <w:tcPr>
-            <w:tcW w:type="dxa" w:w="5102"/>
+            <w:tcW w:type="dxa" w:w="1020"/>
             <w:shd w:val="clear" w:color="auto" w:fill="EEF3FB"/>
           </w:tcPr>
           <w:p>
@@ -6231,15 +6959,15 @@
             <w:r>
               <w:rPr>
                 <w:b w:val="0"/>
-                <w:sz w:val="19"/>
+                <w:sz w:val="18"/>
               </w:rPr>
-              <w:t>Placa de prueba validada con los modelos (tools/placa_demo.py)</w:t>
+              <w:t>4e01a08</w:t>
             </w:r>
           </w:p>
         </w:tc>
         <w:tc>
           <w:tcPr>
-            <w:tcW w:type="dxa" w:w="3345"/>
+            <w:tcW w:type="dxa" w:w="4195"/>
             <w:shd w:val="clear" w:color="auto" w:fill="EEF3FB"/>
           </w:tcPr>
           <w:p>
@@ -6250,59 +6978,15 @@
             <w:r>
               <w:rPr>
                 <w:b w:val="0"/>
-                <w:sz w:val="19"/>
+                <w:sz w:val="18"/>
               </w:rPr>
-              <w:t>Accesorio de respaldo para la demo</w:t>
-            </w:r>
-          </w:p>
-        </w:tc>
-      </w:tr>
-      <w:tr>
-        <w:tc>
-          <w:tcPr>
-            <w:tcW w:type="dxa" w:w="907"/>
-          </w:tcPr>
-          <w:p>
-            <w:pPr>
-              <w:spacing w:after="20"/>
-            </w:pPr>
-            <w:r/>
-            <w:r>
-              <w:rPr>
-                <w:b w:val="0"/>
-                <w:sz w:val="19"/>
-              </w:rPr>
-              <w:t>7 oct</w:t>
+              <w:t>Reconoce una cámara por serie o MAC si cambia de IP</w:t>
             </w:r>
           </w:p>
         </w:tc>
         <w:tc>
           <w:tcPr>
-            <w:tcW w:type="dxa" w:w="5102"/>
-          </w:tcPr>
-          <w:p>
-            <w:pPr>
-              <w:spacing w:after="20"/>
-            </w:pPr>
-            <w:r/>
-          </w:p>
-        </w:tc>
-        <w:tc>
-          <w:tcPr>
-            <w:tcW w:type="dxa" w:w="3345"/>
-          </w:tcPr>
-          <w:p>
-            <w:pPr>
-              <w:spacing w:after="20"/>
-            </w:pPr>
-            <w:r/>
-          </w:p>
-        </w:tc>
-      </w:tr>
-      <w:tr>
-        <w:tc>
-          <w:tcPr>
-            <w:tcW w:type="dxa" w:w="907"/>
+            <w:tcW w:type="dxa" w:w="2778"/>
             <w:shd w:val="clear" w:color="auto" w:fill="EEF3FB"/>
           </w:tcPr>
           <w:p>
@@ -6313,15 +6997,566 @@
             <w:r>
               <w:rPr>
                 <w:b w:val="0"/>
-                <w:sz w:val="19"/>
+                <w:sz w:val="18"/>
               </w:rPr>
-              <w:t>8 oct</w:t>
+              <w:t>Le pasó dos veces a la cámara del equipo</w:t>
+            </w:r>
+          </w:p>
+        </w:tc>
+      </w:tr>
+      <w:tr>
+        <w:tc>
+          <w:tcPr>
+            <w:tcW w:type="dxa" w:w="1361"/>
+          </w:tcPr>
+          <w:p>
+            <w:pPr>
+              <w:spacing w:after="20"/>
+            </w:pPr>
+            <w:r/>
+            <w:r>
+              <w:rPr>
+                <w:b w:val="0"/>
+                <w:sz w:val="18"/>
+              </w:rPr>
+              <w:t>6 oct 21:22</w:t>
             </w:r>
           </w:p>
         </w:tc>
         <w:tc>
           <w:tcPr>
-            <w:tcW w:type="dxa" w:w="5102"/>
+            <w:tcW w:type="dxa" w:w="1020"/>
+          </w:tcPr>
+          <w:p>
+            <w:pPr>
+              <w:spacing w:after="20"/>
+            </w:pPr>
+            <w:r/>
+            <w:r>
+              <w:rPr>
+                <w:b w:val="0"/>
+                <w:sz w:val="18"/>
+              </w:rPr>
+              <w:t>c244f4f</w:t>
+            </w:r>
+          </w:p>
+        </w:tc>
+        <w:tc>
+          <w:tcPr>
+            <w:tcW w:type="dxa" w:w="4195"/>
+          </w:tcPr>
+          <w:p>
+            <w:pPr>
+              <w:spacing w:after="20"/>
+            </w:pPr>
+            <w:r/>
+            <w:r>
+              <w:rPr>
+                <w:b w:val="0"/>
+                <w:sz w:val="18"/>
+              </w:rPr>
+              <w:t>Busca cámaras en todas las redes del equipo, también sin internet</w:t>
+            </w:r>
+          </w:p>
+        </w:tc>
+        <w:tc>
+          <w:tcPr>
+            <w:tcW w:type="dxa" w:w="2778"/>
+          </w:tcPr>
+          <w:p>
+            <w:pPr>
+              <w:spacing w:after="20"/>
+            </w:pPr>
+            <w:r/>
+            <w:r>
+              <w:rPr>
+                <w:b w:val="0"/>
+                <w:sz w:val="18"/>
+              </w:rPr>
+              <w:t>La red del stand no tiene internet</w:t>
+            </w:r>
+          </w:p>
+        </w:tc>
+      </w:tr>
+      <w:tr>
+        <w:tc>
+          <w:tcPr>
+            <w:tcW w:type="dxa" w:w="1361"/>
+            <w:shd w:val="clear" w:color="auto" w:fill="EEF3FB"/>
+          </w:tcPr>
+          <w:p>
+            <w:pPr>
+              <w:spacing w:after="20"/>
+            </w:pPr>
+            <w:r/>
+            <w:r>
+              <w:rPr>
+                <w:b w:val="0"/>
+                <w:sz w:val="18"/>
+              </w:rPr>
+              <w:t>6 oct 21:52</w:t>
+            </w:r>
+          </w:p>
+        </w:tc>
+        <w:tc>
+          <w:tcPr>
+            <w:tcW w:type="dxa" w:w="1020"/>
+            <w:shd w:val="clear" w:color="auto" w:fill="EEF3FB"/>
+          </w:tcPr>
+          <w:p>
+            <w:pPr>
+              <w:spacing w:after="20"/>
+            </w:pPr>
+            <w:r/>
+            <w:r>
+              <w:rPr>
+                <w:b w:val="0"/>
+                <w:sz w:val="18"/>
+              </w:rPr>
+              <w:t>d6d2a3d</w:t>
+            </w:r>
+          </w:p>
+        </w:tc>
+        <w:tc>
+          <w:tcPr>
+            <w:tcW w:type="dxa" w:w="4195"/>
+            <w:shd w:val="clear" w:color="auto" w:fill="EEF3FB"/>
+          </w:tcPr>
+          <w:p>
+            <w:pPr>
+              <w:spacing w:after="20"/>
+            </w:pPr>
+            <w:r/>
+            <w:r>
+              <w:rPr>
+                <w:b w:val="0"/>
+                <w:sz w:val="18"/>
+              </w:rPr>
+              <w:t>RTSP DESCRIBE autenticado en la misma conexión</w:t>
+            </w:r>
+          </w:p>
+        </w:tc>
+        <w:tc>
+          <w:tcPr>
+            <w:tcW w:type="dxa" w:w="2778"/>
+            <w:shd w:val="clear" w:color="auto" w:fill="EEF3FB"/>
+          </w:tcPr>
+          <w:p>
+            <w:pPr>
+              <w:spacing w:after="20"/>
+            </w:pPr>
+            <w:r/>
+            <w:r>
+              <w:rPr>
+                <w:b w:val="0"/>
+                <w:sz w:val="18"/>
+              </w:rPr>
+              <w:t>La Hikvision rechazaba la contraseña correcta (probado con la cámara real)</w:t>
+            </w:r>
+          </w:p>
+        </w:tc>
+      </w:tr>
+      <w:tr>
+        <w:tc>
+          <w:tcPr>
+            <w:tcW w:type="dxa" w:w="1361"/>
+          </w:tcPr>
+          <w:p>
+            <w:pPr>
+              <w:spacing w:after="20"/>
+            </w:pPr>
+            <w:r/>
+            <w:r>
+              <w:rPr>
+                <w:b w:val="0"/>
+                <w:sz w:val="18"/>
+              </w:rPr>
+              <w:t>6 oct 23:39</w:t>
+            </w:r>
+          </w:p>
+        </w:tc>
+        <w:tc>
+          <w:tcPr>
+            <w:tcW w:type="dxa" w:w="1020"/>
+          </w:tcPr>
+          <w:p>
+            <w:pPr>
+              <w:spacing w:after="20"/>
+            </w:pPr>
+            <w:r/>
+            <w:r>
+              <w:rPr>
+                <w:b w:val="0"/>
+                <w:sz w:val="18"/>
+              </w:rPr>
+              <w:t>e7897e6</w:t>
+            </w:r>
+          </w:p>
+        </w:tc>
+        <w:tc>
+          <w:tcPr>
+            <w:tcW w:type="dxa" w:w="4195"/>
+          </w:tcPr>
+          <w:p>
+            <w:pPr>
+              <w:spacing w:after="20"/>
+            </w:pPr>
+            <w:r/>
+            <w:r>
+              <w:rPr>
+                <w:b w:val="0"/>
+                <w:sz w:val="18"/>
+              </w:rPr>
+              <w:t>Video en vivo a 20 fps aparte de la IA; revisión de placas; 3 lecturas coincidentes; rostro reportado en cuanto se ve de frente</w:t>
+            </w:r>
+          </w:p>
+        </w:tc>
+        <w:tc>
+          <w:tcPr>
+            <w:tcW w:type="dxa" w:w="2778"/>
+          </w:tcPr>
+          <w:p>
+            <w:pPr>
+              <w:spacing w:after="20"/>
+            </w:pPr>
+            <w:r/>
+            <w:r>
+              <w:rPr>
+                <w:b w:val="0"/>
+                <w:sz w:val="18"/>
+              </w:rPr>
+              <w:t>Video fluido; menos falsos positivos; alerta con la persona presente</w:t>
+            </w:r>
+          </w:p>
+        </w:tc>
+      </w:tr>
+      <w:tr>
+        <w:tc>
+          <w:tcPr>
+            <w:tcW w:type="dxa" w:w="1361"/>
+            <w:shd w:val="clear" w:color="auto" w:fill="EEF3FB"/>
+          </w:tcPr>
+          <w:p>
+            <w:pPr>
+              <w:spacing w:after="20"/>
+            </w:pPr>
+            <w:r/>
+            <w:r>
+              <w:rPr>
+                <w:b w:val="0"/>
+                <w:sz w:val="18"/>
+              </w:rPr>
+              <w:t>7 oct 00:05</w:t>
+            </w:r>
+          </w:p>
+        </w:tc>
+        <w:tc>
+          <w:tcPr>
+            <w:tcW w:type="dxa" w:w="1020"/>
+            <w:shd w:val="clear" w:color="auto" w:fill="EEF3FB"/>
+          </w:tcPr>
+          <w:p>
+            <w:pPr>
+              <w:spacing w:after="20"/>
+            </w:pPr>
+            <w:r/>
+            <w:r>
+              <w:rPr>
+                <w:b w:val="0"/>
+                <w:sz w:val="18"/>
+              </w:rPr>
+              <w:t>—</w:t>
+            </w:r>
+          </w:p>
+        </w:tc>
+        <w:tc>
+          <w:tcPr>
+            <w:tcW w:type="dxa" w:w="4195"/>
+            <w:shd w:val="clear" w:color="auto" w:fill="EEF3FB"/>
+          </w:tcPr>
+          <w:p>
+            <w:pPr>
+              <w:spacing w:after="20"/>
+            </w:pPr>
+            <w:r/>
+            <w:r>
+              <w:rPr>
+                <w:b w:val="0"/>
+                <w:sz w:val="18"/>
+              </w:rPr>
+              <w:t>Avisos por Telegram configurados y probados</w:t>
+            </w:r>
+          </w:p>
+        </w:tc>
+        <w:tc>
+          <w:tcPr>
+            <w:tcW w:type="dxa" w:w="2778"/>
+            <w:shd w:val="clear" w:color="auto" w:fill="EEF3FB"/>
+          </w:tcPr>
+          <w:p>
+            <w:pPr>
+              <w:spacing w:after="20"/>
+            </w:pPr>
+            <w:r/>
+            <w:r>
+              <w:rPr>
+                <w:b w:val="0"/>
+                <w:sz w:val="18"/>
+              </w:rPr>
+              <w:t>La alerta llega al celular</w:t>
+            </w:r>
+          </w:p>
+        </w:tc>
+      </w:tr>
+      <w:tr>
+        <w:tc>
+          <w:tcPr>
+            <w:tcW w:type="dxa" w:w="1361"/>
+          </w:tcPr>
+          <w:p>
+            <w:pPr>
+              <w:spacing w:after="20"/>
+            </w:pPr>
+            <w:r/>
+            <w:r>
+              <w:rPr>
+                <w:b w:val="0"/>
+                <w:sz w:val="18"/>
+              </w:rPr>
+              <w:t>7 oct 00:16</w:t>
+            </w:r>
+          </w:p>
+        </w:tc>
+        <w:tc>
+          <w:tcPr>
+            <w:tcW w:type="dxa" w:w="1020"/>
+          </w:tcPr>
+          <w:p>
+            <w:pPr>
+              <w:spacing w:after="20"/>
+            </w:pPr>
+            <w:r/>
+            <w:r>
+              <w:rPr>
+                <w:b w:val="0"/>
+                <w:sz w:val="18"/>
+              </w:rPr>
+              <w:t>—</w:t>
+            </w:r>
+          </w:p>
+        </w:tc>
+        <w:tc>
+          <w:tcPr>
+            <w:tcW w:type="dxa" w:w="4195"/>
+          </w:tcPr>
+          <w:p>
+            <w:pPr>
+              <w:spacing w:after="20"/>
+            </w:pPr>
+            <w:r/>
+            <w:r>
+              <w:rPr>
+                <w:b w:val="0"/>
+                <w:sz w:val="18"/>
+              </w:rPr>
+              <w:t>Copia en la nube y restauración probada</w:t>
+            </w:r>
+          </w:p>
+        </w:tc>
+        <w:tc>
+          <w:tcPr>
+            <w:tcW w:type="dxa" w:w="2778"/>
+          </w:tcPr>
+          <w:p>
+            <w:pPr>
+              <w:spacing w:after="20"/>
+            </w:pPr>
+            <w:r/>
+            <w:r>
+              <w:rPr>
+                <w:b w:val="0"/>
+                <w:sz w:val="18"/>
+              </w:rPr>
+              <w:t>Respaldo técnico de los lineamientos</w:t>
+            </w:r>
+          </w:p>
+        </w:tc>
+      </w:tr>
+      <w:tr>
+        <w:tc>
+          <w:tcPr>
+            <w:tcW w:type="dxa" w:w="1361"/>
+            <w:shd w:val="clear" w:color="auto" w:fill="EEF3FB"/>
+          </w:tcPr>
+          <w:p>
+            <w:pPr>
+              <w:spacing w:after="20"/>
+            </w:pPr>
+            <w:r/>
+            <w:r>
+              <w:rPr>
+                <w:b w:val="0"/>
+                <w:sz w:val="18"/>
+              </w:rPr>
+              <w:t>7 oct 00:33</w:t>
+            </w:r>
+          </w:p>
+        </w:tc>
+        <w:tc>
+          <w:tcPr>
+            <w:tcW w:type="dxa" w:w="1020"/>
+            <w:shd w:val="clear" w:color="auto" w:fill="EEF3FB"/>
+          </w:tcPr>
+          <w:p>
+            <w:pPr>
+              <w:spacing w:after="20"/>
+            </w:pPr>
+            <w:r/>
+            <w:r>
+              <w:rPr>
+                <w:b w:val="0"/>
+                <w:sz w:val="18"/>
+              </w:rPr>
+              <w:t>265d993</w:t>
+            </w:r>
+          </w:p>
+        </w:tc>
+        <w:tc>
+          <w:tcPr>
+            <w:tcW w:type="dxa" w:w="4195"/>
+            <w:shd w:val="clear" w:color="auto" w:fill="EEF3FB"/>
+          </w:tcPr>
+          <w:p>
+            <w:pPr>
+              <w:spacing w:after="20"/>
+            </w:pPr>
+            <w:r/>
+            <w:r>
+              <w:rPr>
+                <w:b w:val="0"/>
+                <w:sz w:val="18"/>
+              </w:rPr>
+              <w:t>Pantalla de acceso con identidad propia; movimiento en el dashboard</w:t>
+            </w:r>
+          </w:p>
+        </w:tc>
+        <w:tc>
+          <w:tcPr>
+            <w:tcW w:type="dxa" w:w="2778"/>
+            <w:shd w:val="clear" w:color="auto" w:fill="EEF3FB"/>
+          </w:tcPr>
+          <w:p>
+            <w:pPr>
+              <w:spacing w:after="20"/>
+            </w:pPr>
+            <w:r/>
+            <w:r>
+              <w:rPr>
+                <w:b w:val="0"/>
+                <w:sz w:val="18"/>
+              </w:rPr>
+              <w:t>Producto con identidad, no plantilla</w:t>
+            </w:r>
+          </w:p>
+        </w:tc>
+      </w:tr>
+      <w:tr>
+        <w:tc>
+          <w:tcPr>
+            <w:tcW w:type="dxa" w:w="1361"/>
+          </w:tcPr>
+          <w:p>
+            <w:pPr>
+              <w:spacing w:after="20"/>
+            </w:pPr>
+            <w:r/>
+            <w:r>
+              <w:rPr>
+                <w:b w:val="0"/>
+                <w:sz w:val="18"/>
+              </w:rPr>
+              <w:t>7 oct 00:59</w:t>
+            </w:r>
+          </w:p>
+        </w:tc>
+        <w:tc>
+          <w:tcPr>
+            <w:tcW w:type="dxa" w:w="1020"/>
+          </w:tcPr>
+          <w:p>
+            <w:pPr>
+              <w:spacing w:after="20"/>
+            </w:pPr>
+            <w:r/>
+            <w:r>
+              <w:rPr>
+                <w:b w:val="0"/>
+                <w:sz w:val="18"/>
+              </w:rPr>
+              <w:t>9b58285</w:t>
+            </w:r>
+          </w:p>
+        </w:tc>
+        <w:tc>
+          <w:tcPr>
+            <w:tcW w:type="dxa" w:w="4195"/>
+          </w:tcPr>
+          <w:p>
+            <w:pPr>
+              <w:spacing w:after="20"/>
+            </w:pPr>
+            <w:r/>
+            <w:r>
+              <w:rPr>
+                <w:b w:val="0"/>
+                <w:sz w:val="18"/>
+              </w:rPr>
+              <w:t>Loop del logo para el monitor del stand</w:t>
+            </w:r>
+          </w:p>
+        </w:tc>
+        <w:tc>
+          <w:tcPr>
+            <w:tcW w:type="dxa" w:w="2778"/>
+          </w:tcPr>
+          <w:p>
+            <w:pPr>
+              <w:spacing w:after="20"/>
+            </w:pPr>
+            <w:r/>
+            <w:r>
+              <w:rPr>
+                <w:b w:val="0"/>
+                <w:sz w:val="18"/>
+              </w:rPr>
+              <w:t>Identidad del stand</w:t>
+            </w:r>
+          </w:p>
+        </w:tc>
+      </w:tr>
+      <w:tr>
+        <w:tc>
+          <w:tcPr>
+            <w:tcW w:type="dxa" w:w="1361"/>
+            <w:shd w:val="clear" w:color="auto" w:fill="EEF3FB"/>
+          </w:tcPr>
+          <w:p>
+            <w:pPr>
+              <w:spacing w:after="20"/>
+            </w:pPr>
+            <w:r/>
+            <w:r>
+              <w:rPr>
+                <w:b w:val="0"/>
+                <w:sz w:val="18"/>
+              </w:rPr>
+              <w:t>7 oct</w:t>
+            </w:r>
+          </w:p>
+        </w:tc>
+        <w:tc>
+          <w:tcPr>
+            <w:tcW w:type="dxa" w:w="1020"/>
             <w:shd w:val="clear" w:color="auto" w:fill="EEF3FB"/>
           </w:tcPr>
           <w:p>
@@ -6333,7 +7568,19 @@
         </w:tc>
         <w:tc>
           <w:tcPr>
-            <w:tcW w:type="dxa" w:w="3345"/>
+            <w:tcW w:type="dxa" w:w="4195"/>
+            <w:shd w:val="clear" w:color="auto" w:fill="EEF3FB"/>
+          </w:tcPr>
+          <w:p>
+            <w:pPr>
+              <w:spacing w:after="20"/>
+            </w:pPr>
+            <w:r/>
+          </w:p>
+        </w:tc>
+        <w:tc>
+          <w:tcPr>
+            <w:tcW w:type="dxa" w:w="2778"/>
             <w:shd w:val="clear" w:color="auto" w:fill="EEF3FB"/>
           </w:tcPr>
           <w:p>
@@ -6347,7 +7594,7 @@
       <w:tr>
         <w:tc>
           <w:tcPr>
-            <w:tcW w:type="dxa" w:w="907"/>
+            <w:tcW w:type="dxa" w:w="1361"/>
           </w:tcPr>
           <w:p>
             <w:pPr>
@@ -6357,15 +7604,15 @@
             <w:r>
               <w:rPr>
                 <w:b w:val="0"/>
-                <w:sz w:val="19"/>
+                <w:sz w:val="18"/>
               </w:rPr>
-              <w:t>9 oct</w:t>
+              <w:t>8 oct</w:t>
             </w:r>
           </w:p>
         </w:tc>
         <w:tc>
           <w:tcPr>
-            <w:tcW w:type="dxa" w:w="5102"/>
+            <w:tcW w:type="dxa" w:w="1020"/>
           </w:tcPr>
           <w:p>
             <w:pPr>
@@ -6376,7 +7623,75 @@
         </w:tc>
         <w:tc>
           <w:tcPr>
-            <w:tcW w:type="dxa" w:w="3345"/>
+            <w:tcW w:type="dxa" w:w="4195"/>
+          </w:tcPr>
+          <w:p>
+            <w:pPr>
+              <w:spacing w:after="20"/>
+            </w:pPr>
+            <w:r/>
+          </w:p>
+        </w:tc>
+        <w:tc>
+          <w:tcPr>
+            <w:tcW w:type="dxa" w:w="2778"/>
+          </w:tcPr>
+          <w:p>
+            <w:pPr>
+              <w:spacing w:after="20"/>
+            </w:pPr>
+            <w:r/>
+          </w:p>
+        </w:tc>
+      </w:tr>
+      <w:tr>
+        <w:tc>
+          <w:tcPr>
+            <w:tcW w:type="dxa" w:w="1361"/>
+            <w:shd w:val="clear" w:color="auto" w:fill="EEF3FB"/>
+          </w:tcPr>
+          <w:p>
+            <w:pPr>
+              <w:spacing w:after="20"/>
+            </w:pPr>
+            <w:r/>
+            <w:r>
+              <w:rPr>
+                <w:b w:val="0"/>
+                <w:sz w:val="18"/>
+              </w:rPr>
+              <w:t>9 oct</w:t>
+            </w:r>
+          </w:p>
+        </w:tc>
+        <w:tc>
+          <w:tcPr>
+            <w:tcW w:type="dxa" w:w="1020"/>
+            <w:shd w:val="clear" w:color="auto" w:fill="EEF3FB"/>
+          </w:tcPr>
+          <w:p>
+            <w:pPr>
+              <w:spacing w:after="20"/>
+            </w:pPr>
+            <w:r/>
+          </w:p>
+        </w:tc>
+        <w:tc>
+          <w:tcPr>
+            <w:tcW w:type="dxa" w:w="4195"/>
+            <w:shd w:val="clear" w:color="auto" w:fill="EEF3FB"/>
+          </w:tcPr>
+          <w:p>
+            <w:pPr>
+              <w:spacing w:after="20"/>
+            </w:pPr>
+            <w:r/>
+          </w:p>
+        </w:tc>
+        <w:tc>
+          <w:tcPr>
+            <w:tcW w:type="dxa" w:w="2778"/>
+            <w:shd w:val="clear" w:color="auto" w:fill="EEF3FB"/>
           </w:tcPr>
           <w:p>
             <w:pPr>

</xml_diff>